<commit_message>
Verification pass: fix the remaining issues in the milestone deliverables
Milestone Report: occupation paragraph order, correct outlier example,
explain the two validation set-ups, precision claim replaced by the
out-of-fold comparison, four main drivers stated the same way in every
section, headline-figure note in Table 7, tested cost ratios only,
missing-ratio bullet with the right base, why gradient boosting.

Full-code notebook (text only, outputs unchanged): baseline wording,
refined insights items 1 and 2, pre-go-live guard-rails in the verdict,
YOJ summary row, outlier example.

Co-Authored-By: Claude Opus 5.5 <noreply@anthropic.com>
Claude-Session: https://claude.ai/code/session_013FziBHdvbXYQwd5XRG4tZw
</commit_message>
<xml_diff>
--- a/reports/Loan_Default_Prediction_Milestone_Report.docx
+++ b/reports/Loan_Default_Prediction_Milestone_Report.docx
@@ -2662,7 +2662,7 @@
           <w:sz w:val="22"/>
           <w:szCs w:val="22"/>
         </w:rPr>
-        <w:t xml:space="preserve">Sales (35%) and self-employed (30%) applicants default most. Office workers (13%) and professionals (17%) default least. Debt consolidation is 69% of the stated loan purposes. 'Other' is the largest occupation group (42% of stated occupations). Sales (109 applicants) and self-employed (193 applicants) are small groups, so we read their default rates with care. Home-improvement loans default slightly more often than debt-consolidation loans (22% vs 19%). Both relationships are statistically significant (chi-square tests, p = 0.005 for loan purpose, p &lt; 0.001 for occupation). On its own, loan purpose is too weak to drive decisions, but it changes the risk within some occupations (see below). The bank must handle occupation with care under fair-lending rules.</w:t>
+        <w:t xml:space="preserve">'Other' is the largest occupation group (42% of stated occupations). Sales (35%) and self-employed (30%) applicants default most. Office workers (13%) and professionals (17%) default least. Sales (109 applicants) and self-employed (193 applicants) are small groups, so we read their default rates with care. Debt consolidation is 69% of the stated loan purposes. Home-improvement loans default slightly more often than debt-consolidation loans (22% vs 19%). Both relationships are statistically significant (chi-square tests, p = 0.005 for loan purpose, p &lt; 0.001 for occupation). On its own, loan purpose is too weak to drive decisions, but it changes the risk within some occupations (see below). The bank must handle occupation with care under fair-lending rules.</w:t>
       </w:r>
     </w:p>
     <w:p>
@@ -2877,7 +2877,7 @@
           <w:sz w:val="22"/>
           <w:szCs w:val="22"/>
         </w:rPr>
-        <w:t xml:space="preserve">For the linear model only, we capped LOAN, MORTDUE, VALUE, YOJ, CLAGE, NINQ, CLNO and DEBTINC at the inter-quartile whiskers of the training rows. This removes the impossible debt-to-income and credit-age values. We capped DEROG and DELINQ at their 99th percentile (5 and 6) instead, because their inter-quartile range is zero. Tree models use the untouched values. They split on rank order and would otherwise lose information such as 'above 50% always defaults'.</w:t>
+        <w:t xml:space="preserve">For the linear model only, we capped LOAN, MORTDUE, VALUE, YOJ, CLAGE, NINQ, CLNO and DEBTINC at the inter-quartile whiskers of the training rows. This removes the impossible debt-to-income and credit-age values. We capped DEROG and DELINQ at their 99th percentile (5 and 6) instead, because their inter-quartile range is zero. Tree models use the untouched values. They split on rank order, so extreme values do not distort them. Capping would only merge the largest values into one value.</w:t>
       </w:r>
     </w:p>
     <w:p>
@@ -5259,7 +5259,7 @@
           <w:sz w:val="22"/>
           <w:szCs w:val="22"/>
         </w:rPr>
-        <w:t xml:space="preserve">Cross-validation on the training rows shows the tuning gains, so they do not depend on the test set. Cross-validated recall rose from 63% to 81% for the logistic regression (plain to balanced weights). It rose from 64% to 83% for the decision tree (fully grown to grid search). It rose from 70% to 81% for the random forest (default to grid search). Cross-validated precision fell at the same time, from 79% to 60%, from 66% to 53% and from 83% to 64%. So the final step tuned the forest's decision threshold on expected cost. On repeated out-of-fold predictions of the training rows, the default forest caught 71.4% of defaulters at 82.5% precision with the 0.5 threshold. With the 0.15 threshold it caught 93.7% at 64.7% precision. The cost per 1,000 applicants fell from about $575,000 to about $317,000, which is 45% lower.</w:t>
+        <w:t xml:space="preserve">Cross-validation on the training rows shows the tuning gains, so they do not depend on the test set. Cross-validated recall rose from 63% to 81% for the logistic regression (plain to balanced weights). It rose from 64% to 83% for the decision tree (fully grown to grid search). It rose from 70% to 81% for the random forest (default to grid search). Cross-validated precision fell at the same time, from 79% to 60%, from 66% to 53% and from 83% to 64%. So the final step tuned the forest's decision threshold on expected cost. This step used three different 5-fold splits of the training rows, not the forest's single 3-fold split above. This explains the small difference in its scores. On these out-of-fold predictions, the default forest caught 71.4% of defaulters at 82.5% precision with the 0.5 threshold. With the 0.15 threshold it caught 93.7% at 64.7% precision. The cost per 1,000 applicants fell from about $575,000 to about $317,000, which is 45% lower.</w:t>
       </w:r>
     </w:p>
     <w:p>
@@ -5283,7 +5283,7 @@
           <w:sz w:val="22"/>
           <w:szCs w:val="22"/>
         </w:rPr>
-        <w:t xml:space="preserve">The techniques agree on the main drivers. The main drivers are the debt-to-income ratio and whether it was recorded, the number of delinquent credit lines and derogatory reports, and the credit-history length. Loan, property and mortgage amounts matter in combination. Occupation and loan purpose add little on their own. A linear model, a single tree and the ensembles agree, and this is the best evidence that the signal is real.</w:t>
+        <w:t xml:space="preserve">The techniques agree on four main drivers: the debt-to-income ratio, whether it was recorded, the number of delinquent credit lines and the credit-history length. Derogatory reports also matter in the linear model and in both trees, but the final forest gives them less weight (10th of 27 inputs). Loan, property and mortgage amounts matter in combination. Occupation and loan purpose add little on their own. A linear model, a single tree and the ensembles agree, and this is the best evidence that the signal is real.</w:t>
       </w:r>
     </w:p>
     <w:p>
@@ -5428,7 +5428,7 @@
           <w:sz w:val="22"/>
           <w:szCs w:val="22"/>
         </w:rPr>
-        <w:t xml:space="preserve">Linear vs non-linear: the balanced logistic regression reaches 80% recall but only 61% precision and a ROC-AUC of 0.91. Every forest beats it on precision and ranking at a similar recall, because the data is made of thresholds. Single tree vs ensembles: the pruned tree catches the most defaulters at the 0.5 threshold (82%) but with the lowest precision (53%). Bagging shows that averaging alone lifts precision to 83%. At the 0.5 threshold, the class-weighted forest gives the best balance. It reaches 77% recall at 77% precision, the highest F1 score (0.77) of all models at that threshold, and a ROC-AUC of 0.96. On the chosen yardstick (expected cost at each model's own best threshold), the unweighted Random Forest performs best (Table 5). It costs about $317,000 per 1,000 applicants, against $550,000 for the logistic regression and $607,000 for the tuned tree. It wins because it ranks applicants best (ROC-AUC 0.96), so a lower threshold catches more defaulters without a large loss of precision.</w:t>
+        <w:t xml:space="preserve">Linear vs non-linear: the balanced logistic regression reaches 80% recall but only 61% precision and a ROC-AUC of 0.91. Every forest beats it on precision and ranking at a similar recall, because the data is made of thresholds. Single tree vs ensembles: the pruned tree catches the most defaulters at the 0.5 threshold (82%) but with the lowest precision (53%). Bagging shows that averaging alone lifts precision to 83%. At the 0.5 threshold, the class-weighted forest gives the best balance. It reaches 77% recall at 77% precision, the highest F1 score (0.77) of all models at that threshold, and a ROC-AUC of 0.96. On the chosen yardstick (expected cost at each model's own best threshold), the unweighted Random Forest performs best (Table 5). It costs about $317,000 per 1,000 applicants, against $550,000 for the logistic regression and $607,000 for the tuned tree. It wins because it ranks applicants best (ROC-AUC 0.96). At its own best threshold it catches more defaulters than the logistic regression and the tuned tree, and its precision is still higher. Out of fold, it catches 93.7% of defaulters at 64.7% precision. The logistic regression catches 81.5% at 59.9%, and the tuned tree catches 80.0% at 56.3%.</w:t>
       </w:r>
     </w:p>
     <w:p>
@@ -5452,7 +5452,7 @@
           <w:sz w:val="22"/>
           <w:szCs w:val="22"/>
         </w:rPr>
-        <w:t xml:space="preserve">Yes, and we already apply the first improvement below. Choosing the operating threshold on expected cost rather than at 0.5 moves the forest's recall above 90% at a controlled precision cost. We expect further gains from engineered features such as a combined loan-to-value ratio ((loan + mortgage due) / property value), debt-to-income bands and interaction terms. These features would also help the linear model. Gradient boosting is the next technique to explore. It builds trees one after another, and each new tree corrects the errors of the earlier trees. It keeps what makes trees fit this data: thresholds, combined risk factors and blank fields. Probability calibration would let the bank read the score as a default rate. This matters because the forest's scores understate risk in the decision range (Section 5). We also expect gains from reject inference. Reject inference matters because the data only covers loans the bank approved, so the models never saw the applicants the old process declined.</w:t>
+        <w:t xml:space="preserve">Yes, and we already apply the first improvement below. Choosing the operating threshold on expected cost rather than at 0.5 moves the forest's recall above 90% at a controlled precision cost. We expect further gains from engineered features such as a combined loan-to-value ratio ((loan + mortgage due) / property value), debt-to-income bands and interaction terms. These features would also help the linear model. Gradient boosting is the next technique to explore. It builds trees one after another, and each new tree corrects the errors of the earlier trees. It keeps what makes trees fit this data: thresholds, combined risk factors and blank fields. On tabular data like this it often ranks applicants better than a random forest. Probability calibration would let the bank read the score as a default rate. This matters because the forest's scores understate risk in the decision range (Section 5). We also expect gains from reject inference. Reject inference matters because the data only covers loans the bank approved, so the models never saw the applicants the old process declined.</w:t>
       </w:r>
     </w:p>
     <w:tbl>
@@ -12147,7 +12147,7 @@
           <w:sz w:val="22"/>
           <w:szCs w:val="22"/>
         </w:rPr>
-        <w:t xml:space="preserve">The cost-minimising threshold is 0.15 (flag every applicant whose score exceeds 0.15, an estimated default risk of roughly one in five). It stays at 0.15 for any cost ratio between 3:1 and 6:1. It moves to 0.20 at 2:1, and to 0.10 at 8:1 or more. Figure 6 shows the curves at the 4.5:1 costs. The threshold also stays at 0.15 on a finer 0.01 grid. We repeated the class-weight search for fully grown trees on two other 70/30 splits. The unweighted forest was again the cheapest, and its threshold stayed at 0.15.</w:t>
+        <w:t xml:space="preserve">The cost-minimising threshold is 0.15 (flag every applicant whose score exceeds 0.15, an estimated default risk of roughly one in five). It stays at 0.15 for any cost ratio between 3:1 and 6:1. It moves to 0.20 at 2:1, and to 0.10 at 8:1 and 9:1. Figure 6 shows the curves at the 4.5:1 costs. The threshold also stays at 0.15 on a finer 0.01 grid. We repeated the class-weight search for fully grown trees on two other 70/30 splits. The unweighted forest was again the cheapest, and its threshold stayed at 0.15.</w:t>
       </w:r>
     </w:p>
     <w:p>
@@ -13115,7 +13115,7 @@
           <w:sz w:val="22"/>
           <w:szCs w:val="22"/>
         </w:rPr>
-        <w:t xml:space="preserve">two thirds of all defaulters have no recorded debt-to-income ratio, and the model flags 96% of that group. On applicants with a recorded ratio, it flags 9% and catches 83% of their defaulters at 80% precision. This is the better guide once income verification is mandatory.</w:t>
+        <w:t xml:space="preserve">about a fifth of applicants have no recorded debt-to-income ratio. They include two thirds of all defaulters. The model flags 96% of these applicants and catches 98% of their defaulters. On applicants with a recorded ratio, it flags 9% and catches 83% of their defaulters at 80% precision. This is the better guide once income verification is mandatory.</w:t>
       </w:r>
     </w:p>
     <w:p>
@@ -13569,7 +13569,7 @@
                 <w:sz w:val="19"/>
                 <w:szCs w:val="19"/>
               </w:rPr>
-              <w:t xml:space="preserve">Flag when predicted probability &gt; 0.15. This threshold is cost-minimising on repeated out-of-fold predictions and stable for cost ratios 3:1 to 6:1. It is just below the textbook break-even of 0.18, as expected for a score that understates risk, and unchanged on two other train/test splits. We will re-derive it with the bank's own loss and margin figures. Approve / refer / decline bands at 0.10 and 0.25 keep an underwriter in the loop around the threshold. On the test set the bands hold about 69% / 7% / 24% of applicants, with default rates of about 1% / 24% / 74%. All performance figures are for the 0.15 threshold.</w:t>
+              <w:t xml:space="preserve">Flag when predicted probability &gt; 0.15. This threshold is cost-minimising on repeated out-of-fold predictions and stable for cost ratios 3:1 to 6:1. It is just below the textbook break-even of 0.18, as expected for a score that understates risk, and unchanged on two other train/test splits. We will re-derive it with the bank's own loss and margin figures. Approve / refer / decline bands at 0.10 and 0.25 keep an underwriter in the loop around the threshold. On the test set the bands hold about 69% / 7% / 24% of applicants, with default rates of about 1% / 24% / 74%. The headline figures (92.7% recall, 68.1% precision, 83% lower cost) are for the 0.15 threshold alone.</w:t>
             </w:r>
           </w:p>
         </w:tc>

</xml_diff>

<commit_message>
Close the remaining rubric gaps in both milestone deliverables
Full-code notebook:
- C3: the Model Building approach now justifies the techniques from four
  EDA facts, and says why k-nearest neighbours and SVMs were left out
- C3: the suggested engineered features each name the pattern they capture
- C4: an explicit "Which technique performs relatively better?" answer
  with the reason, and a corrected similar-recall comparison
- Guidelines: a labelled list of six business recommendations, and a
  leading comment on the precision-recall cell

Milestone Report:
- C5: new "How the solution solves the problem" subsection that maps the
  design to the four objectives in Section 1
- C3 and C4: data reasons for the engineered features and a corrected
  similar-recall comparison

Co-Authored-By: Claude Opus 5.5 <noreply@anthropic.com>
Claude-Session: https://claude.ai/code/session_013FziBHdvbXYQwd5XRG4tZw
</commit_message>
<xml_diff>
--- a/reports/Loan_Default_Prediction_Milestone_Report.docx
+++ b/reports/Loan_Default_Prediction_Milestone_Report.docx
@@ -5456,7 +5456,7 @@
           <w:sz w:val="22"/>
           <w:szCs w:val="22"/>
         </w:rPr>
-        <w:t xml:space="preserve">Linear vs non-linear: the balanced logistic regression reaches 80% recall but only 61% precision and a ROC-AUC of 0.91. Every forest beats it on precision and ranking at a similar recall, because the data is made of thresholds. Single tree vs ensembles: the pruned tree catches the most defaulters at the 0.5 threshold (82%) but with the lowest precision (53%). Bagging shows that averaging alone lifts precision to 83%. At the 0.5 threshold, the class-weighted forest gives the best balance. It reaches 77% recall at 77% precision, the highest F1 score (0.77) of all models at that threshold, and a ROC-AUC of 0.96. On the chosen yardstick (expected cost at each model's own best threshold), the unweighted Random Forest performs best (Table 5). On its 22 selected inputs it costs about $324,000 per 1,000 applicants. The bagged trees cost $390,000, the logistic regression $550,000 and the tuned tree $607,000. It wins because it ranks applicants best (ROC-AUC 0.96). At its own best threshold it catches more defaulters than the other techniques, and its precision is still higher. Out of fold, it catches 93.7% of defaulters at 63.9% precision. The bagged trees catch 90.1% at 62.9%. The logistic regression catches 81.5% at 59.9%, and the tuned tree catches 80.0% at 56.3%.</w:t>
+        <w:t xml:space="preserve">Linear vs non-linear: the balanced logistic regression reaches 80% recall but only 61% precision and a ROC-AUC of 0.91. Every forest beats it on precision and ranking, because the risk in this data changes in steps. The class-weighted and recall-tuned forests do this at a similar recall (77% to 79% against 80%). Single tree vs ensembles: the pruned tree catches the most defaulters at the 0.5 threshold (82%) but with the lowest precision (53%). Bagging shows that averaging alone lifts precision to 83%. At the 0.5 threshold, the class-weighted forest gives the best balance. It reaches 77% recall at 77% precision, the highest F1 score (0.77) of all models at that threshold, and a ROC-AUC of 0.96. On the chosen yardstick (expected cost at each model's own best threshold), the unweighted Random Forest performs best (Table 5). On its 22 selected inputs it costs about $324,000 per 1,000 applicants. The bagged trees cost $390,000, the logistic regression $550,000 and the tuned tree $607,000. It wins because it ranks applicants best (ROC-AUC 0.96). At its own best threshold it catches more defaulters than the other techniques, and its precision is still higher. Out of fold, it catches 93.7% of defaulters at 63.9% precision. The bagged trees catch 90.1% at 62.9%. The logistic regression catches 81.5% at 59.9%, and the tuned tree catches 80.0% at 56.3%.</w:t>
       </w:r>
     </w:p>
     <w:p>
@@ -5480,7 +5480,7 @@
           <w:sz w:val="22"/>
           <w:szCs w:val="22"/>
         </w:rPr>
-        <w:t xml:space="preserve">Yes, and we already apply the first improvement below. Choosing the operating threshold on expected cost rather than at 0.5 moves the forest's recall above 90% at a controlled precision cost. We expect further gains from engineered features such as a combined loan-to-value ratio ((loan + mortgage due) / property value), debt-to-income bands and interaction terms. These features would also help the linear model. Gradient boosting is the next technique to explore. It builds trees one after another, and each new tree corrects the errors of the earlier trees. It keeps what makes trees fit this data: thresholds, combined risk factors and blank fields. On tabular data like this it often ranks applicants better than a random forest. Probability calibration would let the bank read the score as a default rate. This matters because the forest's scores understate risk in the decision range (Section 5). We also expect gains from reject inference. Reject inference matters because the data only covers loans the bank approved, so the models never saw the applicants the old process declined.</w:t>
+        <w:t xml:space="preserve">Yes, and we already apply the first improvement below. Choosing the operating threshold on expected cost rather than at 0.5 moves the forest's recall above 90% at a controlled precision cost. We expect further gains from engineered features such as a combined loan-to-value ratio ((loan + mortgage due) / property value), debt-to-income bands and interaction terms. These features would also help the linear model. Debt-to-income bands capture the 45% cliff. Interaction terms capture the combined risk factors in Figure 4. A loan-to-value ratio joins the loan, mortgage and property amounts, which matter in combination rather than alone. Gradient boosting is the next technique to explore. It builds trees one after another, and each new tree corrects the errors of the earlier trees. It keeps what makes trees fit this data: thresholds, combined risk factors and blank fields. On tabular data like this it often ranks applicants better than a random forest. Probability calibration would let the bank read the score as a default rate. This matters because the forest's scores understate risk in the decision range (Section 5). We also expect gains from reject inference. Reject inference matters because the data only covers loans the bank approved, so the models never saw the applicants the old process declined.</w:t>
       </w:r>
     </w:p>
     <w:tbl>
@@ -14237,6 +14237,165 @@
           <w:szCs w:val="19"/>
         </w:rPr>
         <w:t xml:space="preserve">Table 7. The proposed solution design.</w:t>
+      </w:r>
+    </w:p>
+    <w:p>
+      <w:pPr>
+        <w:pStyle w:val="Heading2"/>
+        <w:keepNext/>
+        <w:spacing w:after="120" w:before="240"/>
+      </w:pPr>
+      <w:r>
+        <w:rPr>
+          <w:rFonts w:ascii="Calibri" w:cs="Calibri" w:eastAsia="Calibri" w:hAnsi="Calibri"/>
+          <w:b/>
+          <w:bCs/>
+          <w:color w:val="1E2761"/>
+          <w:sz w:val="25"/>
+          <w:szCs w:val="25"/>
+        </w:rPr>
+        <w:t xml:space="preserve">How the solution solves the problem</w:t>
+      </w:r>
+    </w:p>
+    <w:p>
+      <w:pPr>
+        <w:keepNext/>
+        <w:spacing w:after="140" w:line="276"/>
+        <w:jc w:val="both"/>
+      </w:pPr>
+      <w:r>
+        <w:rPr>
+          <w:rFonts w:ascii="Calibri" w:cs="Calibri" w:eastAsia="Calibri" w:hAnsi="Calibri"/>
+          <w:sz w:val="22"/>
+          <w:szCs w:val="22"/>
+        </w:rPr>
+        <w:t xml:space="preserve">The design meets the four objectives in Section 1.</w:t>
+      </w:r>
+    </w:p>
+    <w:p>
+      <w:pPr>
+        <w:pStyle w:val="ListParagraph"/>
+        <w:numPr>
+          <w:ilvl w:val="0"/>
+          <w:numId w:val="2"/>
+        </w:numPr>
+        <w:spacing w:after="90" w:line="264"/>
+      </w:pPr>
+      <w:r>
+        <w:rPr>
+          <w:rFonts w:ascii="Calibri" w:cs="Calibri" w:eastAsia="Calibri" w:hAnsi="Calibri"/>
+          <w:b/>
+          <w:bCs/>
+          <w:sz w:val="22"/>
+          <w:szCs w:val="22"/>
+        </w:rPr>
+        <w:t xml:space="preserve">Catch defaulters early. </w:t>
+      </w:r>
+      <w:r>
+        <w:rPr>
+          <w:rFonts w:ascii="Calibri" w:cs="Calibri" w:eastAsia="Calibri" w:hAnsi="Calibri"/>
+          <w:sz w:val="22"/>
+          <w:szCs w:val="22"/>
+        </w:rPr>
+        <w:t xml:space="preserve">Per 1,000 applicants, the model flags about 185 of the 200 defaulters before the bank approves the loan.</w:t>
+      </w:r>
+    </w:p>
+    <w:p>
+      <w:pPr>
+        <w:pStyle w:val="ListParagraph"/>
+        <w:numPr>
+          <w:ilvl w:val="0"/>
+          <w:numId w:val="2"/>
+        </w:numPr>
+        <w:spacing w:after="90" w:line="264"/>
+      </w:pPr>
+      <w:r>
+        <w:rPr>
+          <w:rFonts w:ascii="Calibri" w:cs="Calibri" w:eastAsia="Calibri" w:hAnsi="Calibri"/>
+          <w:b/>
+          <w:bCs/>
+          <w:sz w:val="22"/>
+          <w:szCs w:val="22"/>
+        </w:rPr>
+        <w:t xml:space="preserve">Protect good business. </w:t>
+      </w:r>
+      <w:r>
+        <w:rPr>
+          <w:rFonts w:ascii="Calibri" w:cs="Calibri" w:eastAsia="Calibri" w:hAnsi="Calibri"/>
+          <w:sz w:val="22"/>
+          <w:szCs w:val="22"/>
+        </w:rPr>
+        <w:t xml:space="preserve">At the 0.15 threshold the bank approves about 73% of applicants. The model wrongly flags 11% of good applicants.</w:t>
+      </w:r>
+    </w:p>
+    <w:p>
+      <w:pPr>
+        <w:pStyle w:val="ListParagraph"/>
+        <w:numPr>
+          <w:ilvl w:val="0"/>
+          <w:numId w:val="2"/>
+        </w:numPr>
+        <w:spacing w:after="90" w:line="264"/>
+      </w:pPr>
+      <w:r>
+        <w:rPr>
+          <w:rFonts w:ascii="Calibri" w:cs="Calibri" w:eastAsia="Calibri" w:hAnsi="Calibri"/>
+          <w:b/>
+          <w:bCs/>
+          <w:sz w:val="22"/>
+          <w:szCs w:val="22"/>
+        </w:rPr>
+        <w:t xml:space="preserve">Stay interpretable. </w:t>
+      </w:r>
+      <w:r>
+        <w:rPr>
+          <w:rFonts w:ascii="Calibri" w:cs="Calibri" w:eastAsia="Calibri" w:hAnsi="Calibri"/>
+          <w:sz w:val="22"/>
+          <w:szCs w:val="22"/>
+        </w:rPr>
+        <w:t xml:space="preserve">The surrogate tree gives the rules. Per-applicant risk drivers, built before the shadow run, give the reason for each decline.</w:t>
+      </w:r>
+    </w:p>
+    <w:p>
+      <w:pPr>
+        <w:pStyle w:val="ListParagraph"/>
+        <w:numPr>
+          <w:ilvl w:val="0"/>
+          <w:numId w:val="2"/>
+        </w:numPr>
+        <w:spacing w:after="90" w:line="264"/>
+      </w:pPr>
+      <w:r>
+        <w:rPr>
+          <w:rFonts w:ascii="Calibri" w:cs="Calibri" w:eastAsia="Calibri" w:hAnsi="Calibri"/>
+          <w:b/>
+          <w:bCs/>
+          <w:sz w:val="22"/>
+          <w:szCs w:val="22"/>
+        </w:rPr>
+        <w:t xml:space="preserve">Guide policy. </w:t>
+      </w:r>
+      <w:r>
+        <w:rPr>
+          <w:rFonts w:ascii="Calibri" w:cs="Calibri" w:eastAsia="Calibri" w:hAnsi="Calibri"/>
+          <w:sz w:val="22"/>
+          <w:szCs w:val="22"/>
+        </w:rPr>
+        <w:t xml:space="preserve">The analysis names the attributes that matter most. They support rules that the bank can adopt now, such as mandatory income verification and a 45% limit on the debt-to-income ratio.</w:t>
+      </w:r>
+    </w:p>
+    <w:p>
+      <w:pPr>
+        <w:spacing w:after="140" w:line="276"/>
+        <w:jc w:val="both"/>
+      </w:pPr>
+      <w:r>
+        <w:rPr>
+          <w:rFonts w:ascii="Calibri" w:cs="Calibri" w:eastAsia="Calibri" w:hAnsi="Calibri"/>
+          <w:sz w:val="22"/>
+          <w:szCs w:val="22"/>
+        </w:rPr>
+        <w:t xml:space="preserve">Under the indicative costs, the cost of credit errors falls from about $1.8 million to about $0.3 million per 1,000 applicants, 83% less.</w:t>
       </w:r>
     </w:p>
     <w:p>

</xml_diff>